<commit_message>
Refill claim form keeping original layout
Co-Authored-By: Claude Sonnet 5.5 <noreply@anthropic.com>
Claude-Session: https://claude.ai/code/session_01UNm835bsyDRB9owwzhgJ9f
</commit_message>
<xml_diff>
--- a/docs/pretenziya_6657915.docx
+++ b/docs/pretenziya_6657915.docx
@@ -76,11 +76,7 @@
           <w:szCs w:val="22"/>
           <w:highlight w:val="white"/>
         </w:rPr>
-        <w:t>ИП/ООО: Самозанятый (свидетельство № 0010826311), BookZone.uz, договор № 091907н</w:t>
-        <w:br/>
-        <w:t>ИНН/ПИНФЛ: 52401055680079</w:t>
-        <w:br/>
-        <w:t>РАСЧЕТНЫЙ СЧЕТ: ______________________________</w:t>
+        <w:t>ИП/ООО: Самозанятый</w:t>
       </w:r>
       <w:r>
         <w:rPr>
@@ -91,6 +87,8 @@
           <w:szCs w:val="22"/>
           <w:highlight w:val="white"/>
         </w:rPr>
+        <w:br/>
+        <w:t>ИНН</w:t>
       </w:r>
       <w:r>
         <w:rPr>
@@ -101,6 +99,7 @@
           <w:szCs w:val="22"/>
           <w:highlight w:val="white"/>
         </w:rPr>
+        <w:t>/</w:t>
       </w:r>
       <w:r>
         <w:rPr>
@@ -111,6 +110,7 @@
           <w:szCs w:val="22"/>
           <w:highlight w:val="white"/>
         </w:rPr>
+        <w:t>ПИНФЛ:</w:t>
       </w:r>
       <w:r>
         <w:rPr>
@@ -121,6 +121,7 @@
           <w:szCs w:val="22"/>
           <w:highlight w:val="white"/>
         </w:rPr>
+        <w:t xml:space="preserve"> 52401055680079</w:t>
       </w:r>
       <w:r>
         <w:rPr>
@@ -131,6 +132,8 @@
           <w:szCs w:val="22"/>
           <w:highlight w:val="white"/>
         </w:rPr>
+        <w:br/>
+        <w:t>РАСЧЕТНЫЙ СЧЕТ: ______________________________</w:t>
       </w:r>
     </w:p>
     <w:p>
@@ -163,7 +166,6 @@
           <w:highlight w:val="white"/>
         </w:rPr>
         <w:t>МФО: ______________________________</w:t>
-        <w:br/>
       </w:r>
       <w:r>
         <w:rPr>
@@ -174,6 +176,7 @@
           <w:szCs w:val="22"/>
           <w:highlight w:val="white"/>
         </w:rPr>
+        <w:br/>
       </w:r>
     </w:p>
     <w:p>
@@ -583,7 +586,10 @@
               </w:rPr>
             </w:pPr>
             <w:r>
-              <w:t>ALIFBOBOYICHAQOTILLIK — Alifbo bo'yicha qotillik, Agata Kristi</w:t>
+              <w:rPr>
+                <w:sz w:val="18"/>
+              </w:rPr>
+              <w:t>Alifbo bo'yicha qotillik (ALIFBOBOYICHAQOTILLIK)</w:t>
             </w:r>
           </w:p>
         </w:tc>
@@ -603,7 +609,11 @@
                 <w:highlight w:val="white"/>
               </w:rPr>
             </w:pPr>
-            <w:r/>
+            <w:r>
+              <w:rPr>
+                <w:sz w:val="18"/>
+              </w:rPr>
+            </w:r>
           </w:p>
         </w:tc>
         <w:tc>
@@ -623,7 +633,10 @@
               </w:rPr>
             </w:pPr>
             <w:r>
-              <w:t>утеря (возврат комитенту № 6657915 от 14.03.2026, акт утерян)</w:t>
+              <w:rPr>
+                <w:sz w:val="18"/>
+              </w:rPr>
+              <w:t>утеря</w:t>
             </w:r>
           </w:p>
         </w:tc>
@@ -644,6 +657,9 @@
               </w:rPr>
             </w:pPr>
             <w:r>
+              <w:rPr>
+                <w:sz w:val="18"/>
+              </w:rPr>
               <w:t>26 000</w:t>
             </w:r>
           </w:p>
@@ -665,6 +681,9 @@
               </w:rPr>
             </w:pPr>
             <w:r>
+              <w:rPr>
+                <w:sz w:val="18"/>
+              </w:rPr>
               <w:t>1</w:t>
             </w:r>
           </w:p>
@@ -686,6 +705,9 @@
               </w:rPr>
             </w:pPr>
             <w:r>
+              <w:rPr>
+                <w:sz w:val="18"/>
+              </w:rPr>
               <w:t>26 000</w:t>
             </w:r>
           </w:p>
@@ -709,7 +731,10 @@
               </w:rPr>
             </w:pPr>
             <w:r>
-              <w:t>ENSKILOPEDIYA11-SINIY — Bolalar ensiklopediyasi, dinazavrlar, texnika va tablat haqida ensiklopediya (Rang: Ko'k)</w:t>
+              <w:rPr>
+                <w:sz w:val="18"/>
+              </w:rPr>
+              <w:t>Bolalar ensiklopediyasi (Ko'k) (ENSKILOPEDIYA11-SINIY)</w:t>
             </w:r>
           </w:p>
         </w:tc>
@@ -729,7 +754,11 @@
                 <w:highlight w:val="white"/>
               </w:rPr>
             </w:pPr>
-            <w:r/>
+            <w:r>
+              <w:rPr>
+                <w:sz w:val="18"/>
+              </w:rPr>
+            </w:r>
           </w:p>
         </w:tc>
         <w:tc>
@@ -749,7 +778,10 @@
               </w:rPr>
             </w:pPr>
             <w:r>
-              <w:t>утеря (возврат комитенту № 6657915 от 14.03.2026, акт утерян)</w:t>
+              <w:rPr>
+                <w:sz w:val="18"/>
+              </w:rPr>
+              <w:t>утеря</w:t>
             </w:r>
           </w:p>
         </w:tc>
@@ -770,7 +802,9 @@
               </w:rPr>
             </w:pPr>
             <w:r>
-              <w:t>уточнить</w:t>
+              <w:rPr>
+                <w:sz w:val="18"/>
+              </w:rPr>
             </w:r>
           </w:p>
         </w:tc>
@@ -791,6 +825,9 @@
               </w:rPr>
             </w:pPr>
             <w:r>
+              <w:rPr>
+                <w:sz w:val="18"/>
+              </w:rPr>
               <w:t>1</w:t>
             </w:r>
           </w:p>
@@ -812,7 +849,9 @@
               </w:rPr>
             </w:pPr>
             <w:r>
-              <w:t>0</w:t>
+              <w:rPr>
+                <w:sz w:val="18"/>
+              </w:rPr>
             </w:r>
           </w:p>
         </w:tc>
@@ -835,7 +874,10 @@
               </w:rPr>
             </w:pPr>
             <w:r>
-              <w:t>FLESHKARTA-MENTOL — Flesh Kartali Arifmetika. Flesh Kartalar Kitobi (Rang: Mentol)</w:t>
+              <w:rPr>
+                <w:sz w:val="18"/>
+              </w:rPr>
+              <w:t>Flesh Kartali Arifmetika (Mentol) (FLESHKARTA-MENTOL)</w:t>
             </w:r>
           </w:p>
         </w:tc>
@@ -855,7 +897,11 @@
                 <w:highlight w:val="white"/>
               </w:rPr>
             </w:pPr>
-            <w:r/>
+            <w:r>
+              <w:rPr>
+                <w:sz w:val="18"/>
+              </w:rPr>
+            </w:r>
           </w:p>
         </w:tc>
         <w:tc>
@@ -875,7 +921,10 @@
               </w:rPr>
             </w:pPr>
             <w:r>
-              <w:t>утеря (возврат комитенту № 6657915 от 14.03.2026, акт утерян)</w:t>
+              <w:rPr>
+                <w:sz w:val="18"/>
+              </w:rPr>
+              <w:t>утеря</w:t>
             </w:r>
           </w:p>
         </w:tc>
@@ -896,7 +945,9 @@
               </w:rPr>
             </w:pPr>
             <w:r>
-              <w:t>уточнить</w:t>
+              <w:rPr>
+                <w:sz w:val="18"/>
+              </w:rPr>
             </w:r>
           </w:p>
         </w:tc>
@@ -917,6 +968,9 @@
               </w:rPr>
             </w:pPr>
             <w:r>
+              <w:rPr>
+                <w:sz w:val="18"/>
+              </w:rPr>
               <w:t>1</w:t>
             </w:r>
           </w:p>
@@ -938,7 +992,9 @@
               </w:rPr>
             </w:pPr>
             <w:r>
-              <w:t>0</w:t>
+              <w:rPr>
+                <w:sz w:val="18"/>
+              </w:rPr>
             </w:r>
           </w:p>
         </w:tc>
@@ -964,7 +1020,10 @@
               </w:rPr>
             </w:pPr>
             <w:r>
-              <w:t>HITORI — Hitori - yapon boshqotirma to'plami</w:t>
+              <w:rPr>
+                <w:sz w:val="18"/>
+              </w:rPr>
+              <w:t>Hitori - yapon boshqotirma (HITORI)</w:t>
             </w:r>
           </w:p>
         </w:tc>
@@ -987,7 +1046,11 @@
                 <w:highlight w:val="white"/>
               </w:rPr>
             </w:pPr>
-            <w:r/>
+            <w:r>
+              <w:rPr>
+                <w:sz w:val="18"/>
+              </w:rPr>
+            </w:r>
           </w:p>
         </w:tc>
         <w:tc>
@@ -1010,7 +1073,10 @@
               </w:rPr>
             </w:pPr>
             <w:r>
-              <w:t>утеря (возврат комитенту № 6657915 от 14.03.2026, акт утерян)</w:t>
+              <w:rPr>
+                <w:sz w:val="18"/>
+              </w:rPr>
+              <w:t>утеря</w:t>
             </w:r>
           </w:p>
         </w:tc>
@@ -1034,7 +1100,9 @@
               </w:rPr>
             </w:pPr>
             <w:r>
-              <w:t>уточнить</w:t>
+              <w:rPr>
+                <w:sz w:val="18"/>
+              </w:rPr>
             </w:r>
           </w:p>
         </w:tc>
@@ -1058,6 +1126,9 @@
               </w:rPr>
             </w:pPr>
             <w:r>
+              <w:rPr>
+                <w:sz w:val="18"/>
+              </w:rPr>
               <w:t>1</w:t>
             </w:r>
           </w:p>
@@ -1082,7 +1153,9 @@
               </w:rPr>
             </w:pPr>
             <w:r>
-              <w:t>0</w:t>
+              <w:rPr>
+                <w:sz w:val="18"/>
+              </w:rPr>
             </w:r>
           </w:p>
         </w:tc>
@@ -1105,7 +1178,10 @@
               </w:rPr>
             </w:pPr>
             <w:r>
-              <w:t>HUQUQSINF89-BEJEV — Huquq kitobi, 8-9 sinf, test, qo'llanma, to'plam, variant (Rang: Sarg'ish)</w:t>
+              <w:rPr>
+                <w:sz w:val="18"/>
+              </w:rPr>
+              <w:t>Huquq kitobi 8-9 sinf (Sarg'ish) (HUQUQSINF89-BEJEV)</w:t>
             </w:r>
           </w:p>
         </w:tc>
@@ -1125,7 +1201,11 @@
                 <w:highlight w:val="white"/>
               </w:rPr>
             </w:pPr>
-            <w:r/>
+            <w:r>
+              <w:rPr>
+                <w:sz w:val="18"/>
+              </w:rPr>
+            </w:r>
           </w:p>
         </w:tc>
         <w:tc>
@@ -1145,7 +1225,10 @@
               </w:rPr>
             </w:pPr>
             <w:r>
-              <w:t>утеря (возврат комитенту № 6657915 от 14.03.2026, акт утерян)</w:t>
+              <w:rPr>
+                <w:sz w:val="18"/>
+              </w:rPr>
+              <w:t>утеря</w:t>
             </w:r>
           </w:p>
         </w:tc>
@@ -1166,7 +1249,9 @@
               </w:rPr>
             </w:pPr>
             <w:r>
-              <w:t>уточнить</w:t>
+              <w:rPr>
+                <w:sz w:val="18"/>
+              </w:rPr>
             </w:r>
           </w:p>
         </w:tc>
@@ -1187,6 +1272,9 @@
               </w:rPr>
             </w:pPr>
             <w:r>
+              <w:rPr>
+                <w:sz w:val="18"/>
+              </w:rPr>
               <w:t>1</w:t>
             </w:r>
           </w:p>
@@ -1208,7 +1296,9 @@
               </w:rPr>
             </w:pPr>
             <w:r>
-              <w:t>0</w:t>
+              <w:rPr>
+                <w:sz w:val="18"/>
+              </w:rPr>
             </w:r>
           </w:p>
         </w:tc>
@@ -1231,7 +1321,10 @@
               </w:rPr>
             </w:pPr>
             <w:r>
-              <w:t>HUQUQSINF89-BIRUZ — Huquq kitobi, 8-9 sinf, test, qo'llanma, to'plam, variant (Rang: Feruza)</w:t>
+              <w:rPr>
+                <w:sz w:val="18"/>
+              </w:rPr>
+              <w:t>Huquq kitobi 8-9 sinf (Feruza) (HUQUQSINF89-BIRUZ)</w:t>
             </w:r>
           </w:p>
         </w:tc>
@@ -1251,7 +1344,11 @@
                 <w:highlight w:val="white"/>
               </w:rPr>
             </w:pPr>
-            <w:r/>
+            <w:r>
+              <w:rPr>
+                <w:sz w:val="18"/>
+              </w:rPr>
+            </w:r>
           </w:p>
         </w:tc>
         <w:tc>
@@ -1271,7 +1368,10 @@
               </w:rPr>
             </w:pPr>
             <w:r>
-              <w:t>утеря (возврат комитенту № 6657915 от 14.03.2026, акт утерян)</w:t>
+              <w:rPr>
+                <w:sz w:val="18"/>
+              </w:rPr>
+              <w:t>утеря</w:t>
             </w:r>
           </w:p>
         </w:tc>
@@ -1292,7 +1392,9 @@
               </w:rPr>
             </w:pPr>
             <w:r>
-              <w:t>уточнить</w:t>
+              <w:rPr>
+                <w:sz w:val="18"/>
+              </w:rPr>
             </w:r>
           </w:p>
         </w:tc>
@@ -1313,6 +1415,9 @@
               </w:rPr>
             </w:pPr>
             <w:r>
+              <w:rPr>
+                <w:sz w:val="18"/>
+              </w:rPr>
               <w:t>1</w:t>
             </w:r>
           </w:p>
@@ -1334,7 +1439,9 @@
               </w:rPr>
             </w:pPr>
             <w:r>
-              <w:t>0</w:t>
+              <w:rPr>
+                <w:sz w:val="18"/>
+              </w:rPr>
             </w:r>
           </w:p>
         </w:tc>
@@ -1357,7 +1464,10 @@
               </w:rPr>
             </w:pPr>
             <w:r>
-              <w:t>KIMYO2024 — Mega Kimyo 2024 2023-2010 abituriyentlar uchun testlar to'plami</w:t>
+              <w:rPr>
+                <w:sz w:val="18"/>
+              </w:rPr>
+              <w:t>Mega Kimyo 2024 (KIMYO2024)</w:t>
             </w:r>
           </w:p>
         </w:tc>
@@ -1377,7 +1487,11 @@
                 <w:highlight w:val="white"/>
               </w:rPr>
             </w:pPr>
-            <w:r/>
+            <w:r>
+              <w:rPr>
+                <w:sz w:val="18"/>
+              </w:rPr>
+            </w:r>
           </w:p>
         </w:tc>
         <w:tc>
@@ -1397,7 +1511,10 @@
               </w:rPr>
             </w:pPr>
             <w:r>
-              <w:t>утеря (возврат комитенту № 6657915 от 14.03.2026, акт утерян)</w:t>
+              <w:rPr>
+                <w:sz w:val="18"/>
+              </w:rPr>
+              <w:t>утеря</w:t>
             </w:r>
           </w:p>
         </w:tc>
@@ -1418,7 +1535,9 @@
               </w:rPr>
             </w:pPr>
             <w:r>
-              <w:t>уточнить</w:t>
+              <w:rPr>
+                <w:sz w:val="18"/>
+              </w:rPr>
             </w:r>
           </w:p>
         </w:tc>
@@ -1439,6 +1558,9 @@
               </w:rPr>
             </w:pPr>
             <w:r>
+              <w:rPr>
+                <w:sz w:val="18"/>
+              </w:rPr>
               <w:t>1</w:t>
             </w:r>
           </w:p>
@@ -1460,7 +1582,9 @@
               </w:rPr>
             </w:pPr>
             <w:r>
-              <w:t>0</w:t>
+              <w:rPr>
+                <w:sz w:val="18"/>
+              </w:rPr>
             </w:r>
           </w:p>
         </w:tc>
@@ -1483,7 +1607,10 @@
               </w:rPr>
             </w:pPr>
             <w:r>
-              <w:t>MENTAL-LZELEN — Mental arifmetika kitoblari (Rang: Yashil o'rmon rangi)</w:t>
+              <w:rPr>
+                <w:sz w:val="18"/>
+              </w:rPr>
+              <w:t>Mental arifmetika (Yashil) (MENTAL-LZELEN)</w:t>
             </w:r>
           </w:p>
         </w:tc>
@@ -1503,7 +1630,11 @@
                 <w:highlight w:val="white"/>
               </w:rPr>
             </w:pPr>
-            <w:r/>
+            <w:r>
+              <w:rPr>
+                <w:sz w:val="18"/>
+              </w:rPr>
+            </w:r>
           </w:p>
         </w:tc>
         <w:tc>
@@ -1523,7 +1654,10 @@
               </w:rPr>
             </w:pPr>
             <w:r>
-              <w:t>утеря (возврат комитенту № 6657915 от 14.03.2026, акт утерян)</w:t>
+              <w:rPr>
+                <w:sz w:val="18"/>
+              </w:rPr>
+              <w:t>утеря</w:t>
             </w:r>
           </w:p>
         </w:tc>
@@ -1544,7 +1678,9 @@
               </w:rPr>
             </w:pPr>
             <w:r>
-              <w:t>уточнить</w:t>
+              <w:rPr>
+                <w:sz w:val="18"/>
+              </w:rPr>
             </w:r>
           </w:p>
         </w:tc>
@@ -1565,6 +1701,9 @@
               </w:rPr>
             </w:pPr>
             <w:r>
+              <w:rPr>
+                <w:sz w:val="18"/>
+              </w:rPr>
               <w:t>1</w:t>
             </w:r>
           </w:p>
@@ -1586,7 +1725,9 @@
               </w:rPr>
             </w:pPr>
             <w:r>
-              <w:t>0</w:t>
+              <w:rPr>
+                <w:sz w:val="18"/>
+              </w:rPr>
             </w:r>
           </w:p>
         </w:tc>
@@ -1609,7 +1750,10 @@
               </w:rPr>
             </w:pPr>
             <w:r>
-              <w:t>ONATILIVAADABIYOT2QISM — Ona tili va adabiyot Milliy sertifikat 2-qism, Davron Akbar</w:t>
+              <w:rPr>
+                <w:sz w:val="18"/>
+              </w:rPr>
+              <w:t>Ona tili va adabiyot 2-qism, Davron Akbar (ONATILIVAADABIYOT2QISM)</w:t>
             </w:r>
           </w:p>
         </w:tc>
@@ -1629,7 +1773,11 @@
                 <w:highlight w:val="white"/>
               </w:rPr>
             </w:pPr>
-            <w:r/>
+            <w:r>
+              <w:rPr>
+                <w:sz w:val="18"/>
+              </w:rPr>
+            </w:r>
           </w:p>
         </w:tc>
         <w:tc>
@@ -1649,7 +1797,10 @@
               </w:rPr>
             </w:pPr>
             <w:r>
-              <w:t>утеря (возврат комитенту № 6657915 от 14.03.2026, акт утерян)</w:t>
+              <w:rPr>
+                <w:sz w:val="18"/>
+              </w:rPr>
+              <w:t>утеря</w:t>
             </w:r>
           </w:p>
         </w:tc>
@@ -1670,6 +1821,9 @@
               </w:rPr>
             </w:pPr>
             <w:r>
+              <w:rPr>
+                <w:sz w:val="18"/>
+              </w:rPr>
               <w:t>35 000</w:t>
             </w:r>
           </w:p>
@@ -1691,6 +1845,9 @@
               </w:rPr>
             </w:pPr>
             <w:r>
+              <w:rPr>
+                <w:sz w:val="18"/>
+              </w:rPr>
               <w:t>6</w:t>
             </w:r>
           </w:p>
@@ -1712,6 +1869,9 @@
               </w:rPr>
             </w:pPr>
             <w:r>
+              <w:rPr>
+                <w:sz w:val="18"/>
+              </w:rPr>
               <w:t>210 000</w:t>
             </w:r>
           </w:p>
@@ -1735,7 +1895,10 @@
               </w:rPr>
             </w:pPr>
             <w:r>
-              <w:t>OZBEK — O'zbek xalq ertaklari, bolalar ertaklari, xalq og'zaki ijodi</w:t>
+              <w:rPr>
+                <w:sz w:val="18"/>
+              </w:rPr>
+              <w:t>O'zbek xalq ertaklari (OZBEK)</w:t>
             </w:r>
           </w:p>
         </w:tc>
@@ -1755,7 +1918,11 @@
                 <w:highlight w:val="white"/>
               </w:rPr>
             </w:pPr>
-            <w:r/>
+            <w:r>
+              <w:rPr>
+                <w:sz w:val="18"/>
+              </w:rPr>
+            </w:r>
           </w:p>
         </w:tc>
         <w:tc>
@@ -1775,7 +1942,10 @@
               </w:rPr>
             </w:pPr>
             <w:r>
-              <w:t>утеря (возврат комитенту № 6657915 от 14.03.2026, акт утерян)</w:t>
+              <w:rPr>
+                <w:sz w:val="18"/>
+              </w:rPr>
+              <w:t>утеря</w:t>
             </w:r>
           </w:p>
         </w:tc>
@@ -1796,6 +1966,9 @@
               </w:rPr>
             </w:pPr>
             <w:r>
+              <w:rPr>
+                <w:sz w:val="18"/>
+              </w:rPr>
               <w:t>20 000</w:t>
             </w:r>
           </w:p>
@@ -1817,6 +1990,9 @@
               </w:rPr>
             </w:pPr>
             <w:r>
+              <w:rPr>
+                <w:sz w:val="18"/>
+              </w:rPr>
               <w:t>3</w:t>
             </w:r>
           </w:p>
@@ -1838,6 +2014,9 @@
               </w:rPr>
             </w:pPr>
             <w:r>
+              <w:rPr>
+                <w:sz w:val="18"/>
+              </w:rPr>
               <w:t>60 000</w:t>
             </w:r>
           </w:p>
@@ -1861,7 +2040,10 @@
               </w:rPr>
             </w:pPr>
             <w:r>
-              <w:t>SEHRLISHAHAR — Волшебник Изумрудного города, bolalar kitobi, tarbiyaviy adabiyot</w:t>
+              <w:rPr>
+                <w:sz w:val="18"/>
+              </w:rPr>
+              <w:t>Волшебник Изумрудного города (SEHRLISHAHAR)</w:t>
             </w:r>
           </w:p>
         </w:tc>
@@ -1881,7 +2063,11 @@
                 <w:highlight w:val="white"/>
               </w:rPr>
             </w:pPr>
-            <w:r/>
+            <w:r>
+              <w:rPr>
+                <w:sz w:val="18"/>
+              </w:rPr>
+            </w:r>
           </w:p>
         </w:tc>
         <w:tc>
@@ -1901,7 +2087,10 @@
               </w:rPr>
             </w:pPr>
             <w:r>
-              <w:t>утеря (возврат комитенту № 6657915 от 14.03.2026, акт утерян)</w:t>
+              <w:rPr>
+                <w:sz w:val="18"/>
+              </w:rPr>
+              <w:t>утеря</w:t>
             </w:r>
           </w:p>
         </w:tc>
@@ -1922,7 +2111,9 @@
               </w:rPr>
             </w:pPr>
             <w:r>
-              <w:t>уточнить</w:t>
+              <w:rPr>
+                <w:sz w:val="18"/>
+              </w:rPr>
             </w:r>
           </w:p>
         </w:tc>
@@ -1943,6 +2134,9 @@
               </w:rPr>
             </w:pPr>
             <w:r>
+              <w:rPr>
+                <w:sz w:val="18"/>
+              </w:rPr>
               <w:t>1</w:t>
             </w:r>
           </w:p>
@@ -1964,7 +2158,9 @@
               </w:rPr>
             </w:pPr>
             <w:r>
-              <w:t>0</w:t>
+              <w:rPr>
+                <w:sz w:val="18"/>
+              </w:rPr>
             </w:r>
           </w:p>
         </w:tc>
@@ -1987,7 +2183,10 @@
               </w:rPr>
             </w:pPr>
             <w:r>
-              <w:t>SHEDEVRONATILI-MENTOL — Ona tili — Shedevr testlar (I, II, III qismlar) (Rang: Mentol)</w:t>
+              <w:rPr>
+                <w:sz w:val="18"/>
+              </w:rPr>
+              <w:t>Ona tili — Shedevr testlar (Mentol) (SHEDEVRONATILI-MENTOL)</w:t>
             </w:r>
           </w:p>
         </w:tc>
@@ -2007,7 +2206,11 @@
                 <w:highlight w:val="white"/>
               </w:rPr>
             </w:pPr>
-            <w:r/>
+            <w:r>
+              <w:rPr>
+                <w:sz w:val="18"/>
+              </w:rPr>
+            </w:r>
           </w:p>
         </w:tc>
         <w:tc>
@@ -2027,7 +2230,10 @@
               </w:rPr>
             </w:pPr>
             <w:r>
-              <w:t>утеря (возврат комитенту № 6657915 от 14.03.2026, акт утерян)</w:t>
+              <w:rPr>
+                <w:sz w:val="18"/>
+              </w:rPr>
+              <w:t>утеря</w:t>
             </w:r>
           </w:p>
         </w:tc>
@@ -2048,6 +2254,9 @@
               </w:rPr>
             </w:pPr>
             <w:r>
+              <w:rPr>
+                <w:sz w:val="18"/>
+              </w:rPr>
               <w:t>26 000</w:t>
             </w:r>
           </w:p>
@@ -2069,6 +2278,9 @@
               </w:rPr>
             </w:pPr>
             <w:r>
+              <w:rPr>
+                <w:sz w:val="18"/>
+              </w:rPr>
               <w:t>2</w:t>
             </w:r>
           </w:p>
@@ -2090,6 +2302,9 @@
               </w:rPr>
             </w:pPr>
             <w:r>
+              <w:rPr>
+                <w:sz w:val="18"/>
+              </w:rPr>
               <w:t>52 000</w:t>
             </w:r>
           </w:p>
@@ -2113,7 +2328,10 @@
               </w:rPr>
             </w:pPr>
             <w:r>
-              <w:t>SUDOKU — Sudoku - mantiqiy boshqotirmalar</w:t>
+              <w:rPr>
+                <w:sz w:val="18"/>
+              </w:rPr>
+              <w:t>Sudoku - mantiqiy boshqotirmalar (SUDOKU)</w:t>
             </w:r>
           </w:p>
         </w:tc>
@@ -2133,7 +2351,11 @@
                 <w:highlight w:val="white"/>
               </w:rPr>
             </w:pPr>
-            <w:r/>
+            <w:r>
+              <w:rPr>
+                <w:sz w:val="18"/>
+              </w:rPr>
+            </w:r>
           </w:p>
         </w:tc>
         <w:tc>
@@ -2153,7 +2375,10 @@
               </w:rPr>
             </w:pPr>
             <w:r>
-              <w:t>утеря (возврат комитенту № 6657915 от 14.03.2026, акт утерян)</w:t>
+              <w:rPr>
+                <w:sz w:val="18"/>
+              </w:rPr>
+              <w:t>утеря</w:t>
             </w:r>
           </w:p>
         </w:tc>
@@ -2174,6 +2399,9 @@
               </w:rPr>
             </w:pPr>
             <w:r>
+              <w:rPr>
+                <w:sz w:val="18"/>
+              </w:rPr>
               <w:t>30 000</w:t>
             </w:r>
           </w:p>
@@ -2195,6 +2423,9 @@
               </w:rPr>
             </w:pPr>
             <w:r>
+              <w:rPr>
+                <w:sz w:val="18"/>
+              </w:rPr>
               <w:t>6</w:t>
             </w:r>
           </w:p>
@@ -2216,6 +2447,9 @@
               </w:rPr>
             </w:pPr>
             <w:r>
+              <w:rPr>
+                <w:sz w:val="18"/>
+              </w:rPr>
               <w:t>180 000</w:t>
             </w:r>
           </w:p>
@@ -2239,7 +2473,10 @@
               </w:rPr>
             </w:pPr>
             <w:r>
-              <w:t>TARIXMILLIYSERTIFIKAT — Tarix milliy sertifikat A+</w:t>
+              <w:rPr>
+                <w:sz w:val="18"/>
+              </w:rPr>
+              <w:t>Tarix milliy sertifikat A+ (TARIXMILLIYSERTIFIKAT)</w:t>
             </w:r>
           </w:p>
         </w:tc>
@@ -2259,7 +2496,11 @@
                 <w:highlight w:val="white"/>
               </w:rPr>
             </w:pPr>
-            <w:r/>
+            <w:r>
+              <w:rPr>
+                <w:sz w:val="18"/>
+              </w:rPr>
+            </w:r>
           </w:p>
         </w:tc>
         <w:tc>
@@ -2279,7 +2520,10 @@
               </w:rPr>
             </w:pPr>
             <w:r>
-              <w:t>утеря (возврат комитенту № 6657915 от 14.03.2026, акт утерян)</w:t>
+              <w:rPr>
+                <w:sz w:val="18"/>
+              </w:rPr>
+              <w:t>утеря</w:t>
             </w:r>
           </w:p>
         </w:tc>
@@ -2300,6 +2544,9 @@
               </w:rPr>
             </w:pPr>
             <w:r>
+              <w:rPr>
+                <w:sz w:val="18"/>
+              </w:rPr>
               <w:t>22 000</w:t>
             </w:r>
           </w:p>
@@ -2321,6 +2568,9 @@
               </w:rPr>
             </w:pPr>
             <w:r>
+              <w:rPr>
+                <w:sz w:val="18"/>
+              </w:rPr>
               <w:t>3</w:t>
             </w:r>
           </w:p>
@@ -2342,6 +2592,9 @@
               </w:rPr>
             </w:pPr>
             <w:r>
+              <w:rPr>
+                <w:sz w:val="18"/>
+              </w:rPr>
               <w:t>66 000</w:t>
             </w:r>
           </w:p>
@@ -2365,7 +2618,10 @@
               </w:rPr>
             </w:pPr>
             <w:r>
-              <w:t>TARIXMILLIYSERTIFIKATSARDORBEK — Milliy sertifikat Tarix fanidan, namunaviy test topshiriqlari</w:t>
+              <w:rPr>
+                <w:sz w:val="18"/>
+              </w:rPr>
+              <w:t>Milliy sertifikat Tarix, test topshiriqlari (TARIXMILLIYSERTIFIKATSARDORBEK)</w:t>
             </w:r>
           </w:p>
         </w:tc>
@@ -2385,7 +2641,11 @@
                 <w:highlight w:val="white"/>
               </w:rPr>
             </w:pPr>
-            <w:r/>
+            <w:r>
+              <w:rPr>
+                <w:sz w:val="18"/>
+              </w:rPr>
+            </w:r>
           </w:p>
         </w:tc>
         <w:tc>
@@ -2405,7 +2665,10 @@
               </w:rPr>
             </w:pPr>
             <w:r>
-              <w:t>утеря (возврат комитенту № 6657915 от 14.03.2026, акт утерян)</w:t>
+              <w:rPr>
+                <w:sz w:val="18"/>
+              </w:rPr>
+              <w:t>утеря</w:t>
             </w:r>
           </w:p>
         </w:tc>
@@ -2426,6 +2689,9 @@
               </w:rPr>
             </w:pPr>
             <w:r>
+              <w:rPr>
+                <w:sz w:val="18"/>
+              </w:rPr>
               <w:t>22 000</w:t>
             </w:r>
           </w:p>
@@ -2447,6 +2713,9 @@
               </w:rPr>
             </w:pPr>
             <w:r>
+              <w:rPr>
+                <w:sz w:val="18"/>
+              </w:rPr>
               <w:t>2</w:t>
             </w:r>
           </w:p>
@@ -2468,6 +2737,9 @@
               </w:rPr>
             </w:pPr>
             <w:r>
+              <w:rPr>
+                <w:sz w:val="18"/>
+              </w:rPr>
               <w:t>44 000</w:t>
             </w:r>
           </w:p>
@@ -2578,6 +2850,9 @@
               </w:rPr>
             </w:pPr>
             <w:r>
+              <w:rPr>
+                <w:sz w:val="18"/>
+              </w:rPr>
               <w:t>31</w:t>
             </w:r>
           </w:p>
@@ -2603,7 +2878,7 @@
               <w:rPr>
                 <w:rFonts w:ascii="Times New Roman" w:eastAsia="Times New Roman" w:hAnsi="Times New Roman" w:cs="Times New Roman"/>
                 <w:color w:val="000000"/>
-                <w:sz w:val="24"/>
+                <w:sz w:val="18"/>
                 <w:szCs w:val="24"/>
                 <w:highlight w:val="lightGray"/>
               </w:rPr>
@@ -2757,7 +3032,7 @@
           <w:sz w:val="24"/>
           <w:szCs w:val="24"/>
         </w:rPr>
-        <w:t>Итоговая сумма к выплате 638 000 сум.</w:t>
+        <w:t>Итоговая сумма к выплате</w:t>
       </w:r>
       <w:r>
         <w:rPr>
@@ -2766,6 +3041,7 @@
           <w:sz w:val="24"/>
           <w:szCs w:val="24"/>
         </w:rPr>
+        <w:t xml:space="preserve"> </w:t>
       </w:r>
       <w:r>
         <w:rPr>
@@ -2776,6 +3052,7 @@
           <w:szCs w:val="22"/>
           <w:highlight w:val="white"/>
         </w:rPr>
+        <w:t>638 000</w:t>
       </w:r>
       <w:r>
         <w:rPr>
@@ -2785,6 +3062,7 @@
           <w:sz w:val="22"/>
           <w:szCs w:val="22"/>
         </w:rPr>
+        <w:t xml:space="preserve"> сум.</w:t>
       </w:r>
     </w:p>
     <w:p>

</xml_diff>